<commit_message>
Exclusiecriterium 10: gelijktijdige deelname aan een andere klinische studie (Janou 27/10) in eCRF 01 en 06 (alle kopieen), REDCap e01_e10 en elcr_inclusion, protocol 4.1 en synopsis en beide manuscripten als bijgehouden wijziging, BRONNEN
Co-Authored-By: Claude Opus 5.5 <noreply@anthropic.com>
</commit_message>
<xml_diff>
--- a/(e)CRF/Per nummer/01_Screening voor toestemming.docx
+++ b/(e)CRF/Per nummer/01_Screening voor toestemming.docx
@@ -1180,6 +1180,47 @@
                 <w:color w:val="24303B"/>
               </w:rPr>
               <w:t>Weigeren het voorgeschreven beschermend schoeisel te dragen, of weigeren de draagsensor (Orthotimer) in de voetorthese</w:t>
+            </w:r>
+          </w:p>
+        </w:tc>
+      </w:tr>
+      <w:tr>
+        <w:tc>
+          <w:tcPr>
+            <w:tcW w:w="567" w:type="dxa"/>
+          </w:tcPr>
+          <w:p>
+            <w:pPr>
+              <w:spacing w:line="360" w:lineRule="auto"/>
+              <w:jc w:val="center"/>
+              <w:rPr>
+                <w:rFonts w:ascii="Segoe UI Symbol" w:hAnsi="Segoe UI Symbol" w:cs="Segoe UI Symbol"/>
+              </w:rPr>
+            </w:pPr>
+            <w:r>
+              <w:rPr>
+                <w:rFonts w:ascii="Segoe UI Symbol" w:hAnsi="Segoe UI Symbol" w:cs="Segoe UI Symbol"/>
+              </w:rPr>
+              <w:t>☐</w:t>
+            </w:r>
+          </w:p>
+        </w:tc>
+        <w:tc>
+          <w:tcPr>
+            <w:tcW w:w="8504" w:type="dxa"/>
+          </w:tcPr>
+          <w:p>
+            <w:pPr>
+              <w:spacing w:line="360" w:lineRule="auto"/>
+              <w:rPr>
+                <w:rFonts w:ascii="Calibri" w:hAnsi="Calibri" w:cs="Calibri"/>
+              </w:rPr>
+            </w:pPr>
+            <w:r>
+              <w:rPr>
+                <w:color w:val="24303B"/>
+              </w:rPr>
+              <w:t>Gelijktijdig deelnemen aan een andere klinische studie</w:t>
             </w:r>
           </w:p>
         </w:tc>

</xml_diff>